<commit_message>
updated files and folders name
</commit_message>
<xml_diff>
--- a/! Buổi thực hành số 6 (Supervised Classification)/! Lab06a - Decision Trees Excercise/EX01_CayQuyetDinh.docx
+++ b/! Buổi thực hành số 6 (Supervised Classification)/! Lab06a - Decision Trees Excercise/EX01_CayQuyetDinh.docx
@@ -11,9 +11,17 @@
       </w:pPr>
       <w:r>
         <w:rPr>
+          <w:b/>
+          <w:bCs/>
           <w:lang w:val="en-GB"/>
         </w:rPr>
-        <w:t>(1) Cho cơ sở dữ liệu sau:</w:t>
+        <w:t>(1)</w:t>
+      </w:r>
+      <w:r>
+        <w:rPr>
+          <w:lang w:val="en-GB"/>
+        </w:rPr>
+        <w:t xml:space="preserve"> Cho cơ sở dữ liệu sau:</w:t>
       </w:r>
     </w:p>
     <w:tbl>
@@ -105,7 +113,7 @@
         </w:tc>
         <w:tc>
           <w:tcPr>
-            <w:tcW w:w="0" w:type="auto"/>
+            <w:tcW w:w="846" w:type="dxa"/>
           </w:tcPr>
           <w:p>
             <w:pPr>
@@ -126,7 +134,7 @@
         </w:tc>
         <w:tc>
           <w:tcPr>
-            <w:tcW w:w="0" w:type="auto"/>
+            <w:tcW w:w="1200" w:type="dxa"/>
           </w:tcPr>
           <w:p>
             <w:pPr>
@@ -212,7 +220,7 @@
         </w:tc>
         <w:tc>
           <w:tcPr>
-            <w:tcW w:w="0" w:type="auto"/>
+            <w:tcW w:w="846" w:type="dxa"/>
           </w:tcPr>
           <w:p>
             <w:pPr>
@@ -225,7 +233,7 @@
         </w:tc>
         <w:tc>
           <w:tcPr>
-            <w:tcW w:w="0" w:type="auto"/>
+            <w:tcW w:w="1200" w:type="dxa"/>
           </w:tcPr>
           <w:p>
             <w:pPr>
@@ -295,7 +303,7 @@
         </w:tc>
         <w:tc>
           <w:tcPr>
-            <w:tcW w:w="0" w:type="auto"/>
+            <w:tcW w:w="846" w:type="dxa"/>
           </w:tcPr>
           <w:p>
             <w:pPr>
@@ -308,7 +316,7 @@
         </w:tc>
         <w:tc>
           <w:tcPr>
-            <w:tcW w:w="0" w:type="auto"/>
+            <w:tcW w:w="1200" w:type="dxa"/>
           </w:tcPr>
           <w:p>
             <w:pPr>
@@ -378,7 +386,7 @@
         </w:tc>
         <w:tc>
           <w:tcPr>
-            <w:tcW w:w="0" w:type="auto"/>
+            <w:tcW w:w="846" w:type="dxa"/>
           </w:tcPr>
           <w:p>
             <w:pPr>
@@ -391,7 +399,7 @@
         </w:tc>
         <w:tc>
           <w:tcPr>
-            <w:tcW w:w="0" w:type="auto"/>
+            <w:tcW w:w="1200" w:type="dxa"/>
           </w:tcPr>
           <w:p>
             <w:pPr>
@@ -461,7 +469,7 @@
         </w:tc>
         <w:tc>
           <w:tcPr>
-            <w:tcW w:w="0" w:type="auto"/>
+            <w:tcW w:w="846" w:type="dxa"/>
           </w:tcPr>
           <w:p>
             <w:pPr>
@@ -474,7 +482,7 @@
         </w:tc>
         <w:tc>
           <w:tcPr>
-            <w:tcW w:w="0" w:type="auto"/>
+            <w:tcW w:w="1200" w:type="dxa"/>
           </w:tcPr>
           <w:p>
             <w:pPr>
@@ -544,7 +552,7 @@
         </w:tc>
         <w:tc>
           <w:tcPr>
-            <w:tcW w:w="0" w:type="auto"/>
+            <w:tcW w:w="846" w:type="dxa"/>
           </w:tcPr>
           <w:p>
             <w:pPr>
@@ -557,7 +565,7 @@
         </w:tc>
         <w:tc>
           <w:tcPr>
-            <w:tcW w:w="0" w:type="auto"/>
+            <w:tcW w:w="1200" w:type="dxa"/>
           </w:tcPr>
           <w:p>
             <w:pPr>
@@ -627,7 +635,7 @@
         </w:tc>
         <w:tc>
           <w:tcPr>
-            <w:tcW w:w="0" w:type="auto"/>
+            <w:tcW w:w="846" w:type="dxa"/>
           </w:tcPr>
           <w:p>
             <w:pPr>
@@ -640,7 +648,7 @@
         </w:tc>
         <w:tc>
           <w:tcPr>
-            <w:tcW w:w="0" w:type="auto"/>
+            <w:tcW w:w="1200" w:type="dxa"/>
           </w:tcPr>
           <w:p>
             <w:pPr>
@@ -710,7 +718,7 @@
         </w:tc>
         <w:tc>
           <w:tcPr>
-            <w:tcW w:w="0" w:type="auto"/>
+            <w:tcW w:w="846" w:type="dxa"/>
           </w:tcPr>
           <w:p>
             <w:pPr>
@@ -723,7 +731,7 @@
         </w:tc>
         <w:tc>
           <w:tcPr>
-            <w:tcW w:w="0" w:type="auto"/>
+            <w:tcW w:w="1200" w:type="dxa"/>
           </w:tcPr>
           <w:p>
             <w:pPr>
@@ -793,7 +801,7 @@
         </w:tc>
         <w:tc>
           <w:tcPr>
-            <w:tcW w:w="0" w:type="auto"/>
+            <w:tcW w:w="846" w:type="dxa"/>
           </w:tcPr>
           <w:p>
             <w:pPr>
@@ -806,7 +814,7 @@
         </w:tc>
         <w:tc>
           <w:tcPr>
-            <w:tcW w:w="0" w:type="auto"/>
+            <w:tcW w:w="1200" w:type="dxa"/>
           </w:tcPr>
           <w:p>
             <w:pPr>
@@ -876,7 +884,7 @@
         </w:tc>
         <w:tc>
           <w:tcPr>
-            <w:tcW w:w="0" w:type="auto"/>
+            <w:tcW w:w="846" w:type="dxa"/>
           </w:tcPr>
           <w:p>
             <w:pPr>
@@ -889,7 +897,7 @@
         </w:tc>
         <w:tc>
           <w:tcPr>
-            <w:tcW w:w="0" w:type="auto"/>
+            <w:tcW w:w="1200" w:type="dxa"/>
           </w:tcPr>
           <w:p>
             <w:pPr>
@@ -959,7 +967,7 @@
         </w:tc>
         <w:tc>
           <w:tcPr>
-            <w:tcW w:w="0" w:type="auto"/>
+            <w:tcW w:w="846" w:type="dxa"/>
           </w:tcPr>
           <w:p>
             <w:pPr>
@@ -972,7 +980,7 @@
         </w:tc>
         <w:tc>
           <w:tcPr>
-            <w:tcW w:w="0" w:type="auto"/>
+            <w:tcW w:w="1200" w:type="dxa"/>
           </w:tcPr>
           <w:p>
             <w:pPr>
@@ -1042,7 +1050,7 @@
         </w:tc>
         <w:tc>
           <w:tcPr>
-            <w:tcW w:w="0" w:type="auto"/>
+            <w:tcW w:w="846" w:type="dxa"/>
           </w:tcPr>
           <w:p>
             <w:pPr>
@@ -1055,7 +1063,7 @@
         </w:tc>
         <w:tc>
           <w:tcPr>
-            <w:tcW w:w="0" w:type="auto"/>
+            <w:tcW w:w="1200" w:type="dxa"/>
           </w:tcPr>
           <w:p>
             <w:pPr>
@@ -1125,7 +1133,7 @@
         </w:tc>
         <w:tc>
           <w:tcPr>
-            <w:tcW w:w="0" w:type="auto"/>
+            <w:tcW w:w="846" w:type="dxa"/>
           </w:tcPr>
           <w:p>
             <w:pPr>
@@ -1138,7 +1146,7 @@
         </w:tc>
         <w:tc>
           <w:tcPr>
-            <w:tcW w:w="0" w:type="auto"/>
+            <w:tcW w:w="1200" w:type="dxa"/>
           </w:tcPr>
           <w:p>
             <w:pPr>
@@ -1208,7 +1216,7 @@
         </w:tc>
         <w:tc>
           <w:tcPr>
-            <w:tcW w:w="0" w:type="auto"/>
+            <w:tcW w:w="846" w:type="dxa"/>
           </w:tcPr>
           <w:p>
             <w:pPr>
@@ -1221,7 +1229,7 @@
         </w:tc>
         <w:tc>
           <w:tcPr>
-            <w:tcW w:w="0" w:type="auto"/>
+            <w:tcW w:w="1200" w:type="dxa"/>
           </w:tcPr>
           <w:p>
             <w:pPr>
@@ -1291,7 +1299,7 @@
         </w:tc>
         <w:tc>
           <w:tcPr>
-            <w:tcW w:w="0" w:type="auto"/>
+            <w:tcW w:w="846" w:type="dxa"/>
           </w:tcPr>
           <w:p>
             <w:pPr>
@@ -1304,7 +1312,7 @@
         </w:tc>
         <w:tc>
           <w:tcPr>
-            <w:tcW w:w="0" w:type="auto"/>
+            <w:tcW w:w="1200" w:type="dxa"/>
           </w:tcPr>
           <w:p>
             <w:pPr>
@@ -3793,6 +3801,11 @@
     <w:p>
       <w:pPr>
         <w:pStyle w:val="38"/>
+      </w:pPr>
+    </w:p>
+    <w:p>
+      <w:pPr>
+        <w:pStyle w:val="38"/>
         <w:rPr>
           <w:b/>
           <w:bCs/>
@@ -3840,8 +3853,204 @@
       <w:pPr>
         <w:pStyle w:val="38"/>
       </w:pPr>
+    </w:p>
+    <w:p>
+      <w:pPr>
+        <w:pStyle w:val="38"/>
+        <w:rPr>
+          <w:rFonts w:hint="default"/>
+          <w:b/>
+          <w:bCs/>
+          <w:lang w:val="vi-VN"/>
+        </w:rPr>
+      </w:pPr>
+      <w:r>
+        <w:rPr>
+          <w:rFonts w:hint="default"/>
+          <w:b/>
+          <w:bCs/>
+          <w:lang w:val="vi-VN"/>
+        </w:rPr>
+        <w:t xml:space="preserve">Câu c) </w:t>
+      </w:r>
+      <w:r>
+        <w:rPr>
+          <w:rFonts w:hint="default"/>
+          <w:lang w:val="vi-VN"/>
+        </w:rPr>
+        <w:t>T</w:t>
+      </w:r>
+      <w:r>
+        <w:t>ìm cây quyết định dùng Gini Index và Classification Error</w:t>
+      </w:r>
+    </w:p>
+    <w:p>
+      <w:pPr>
+        <w:pStyle w:val="38"/>
+        <w:rPr>
+          <w:rFonts w:hint="default"/>
+          <w:b/>
+          <w:bCs/>
+          <w:lang w:val="vi-VN"/>
+        </w:rPr>
+      </w:pPr>
+      <w:r>
+        <w:rPr>
+          <w:rFonts w:hint="default"/>
+          <w:b/>
+          <w:bCs/>
+          <w:lang w:val="vi-VN"/>
+        </w:rPr>
+        <w:t>Gini Index:</w:t>
+      </w:r>
+    </w:p>
+    <w:p>
+      <w:pPr>
+        <w:pStyle w:val="38"/>
+        <w:rPr>
+          <w:rFonts w:hint="default"/>
+          <w:b w:val="0"/>
+          <w:bCs w:val="0"/>
+          <w:lang w:val="vi-VN"/>
+        </w:rPr>
+      </w:pPr>
+      <w:r>
+        <w:rPr>
+          <w:rFonts w:hint="default"/>
+          <w:b w:val="0"/>
+          <w:bCs w:val="0"/>
+          <w:lang w:val="vi-VN"/>
+        </w:rPr>
+        <w:t xml:space="preserve">- </w:t>
+      </w:r>
       <w:bookmarkStart w:id="0" w:name="_GoBack"/>
       <w:bookmarkEnd w:id="0"/>
+    </w:p>
+    <w:p>
+      <w:pPr>
+        <w:pStyle w:val="38"/>
+        <w:rPr>
+          <w:rFonts w:hint="default"/>
+          <w:lang w:val="vi-VN"/>
+        </w:rPr>
+      </w:pPr>
+    </w:p>
+    <w:p>
+      <w:pPr>
+        <w:pStyle w:val="38"/>
+        <w:rPr>
+          <w:rFonts w:hint="default"/>
+          <w:lang w:val="vi-VN"/>
+        </w:rPr>
+      </w:pPr>
+    </w:p>
+    <w:p>
+      <w:pPr>
+        <w:pStyle w:val="38"/>
+        <w:rPr>
+          <w:rFonts w:hint="default"/>
+          <w:lang w:val="vi-VN"/>
+        </w:rPr>
+      </w:pPr>
+    </w:p>
+    <w:p>
+      <w:pPr>
+        <w:pStyle w:val="38"/>
+        <w:rPr>
+          <w:rFonts w:hint="default"/>
+          <w:lang w:val="vi-VN"/>
+        </w:rPr>
+      </w:pPr>
+    </w:p>
+    <w:p>
+      <w:pPr>
+        <w:pStyle w:val="38"/>
+        <w:rPr>
+          <w:rFonts w:hint="default"/>
+          <w:lang w:val="vi-VN"/>
+        </w:rPr>
+      </w:pPr>
+    </w:p>
+    <w:p>
+      <w:pPr>
+        <w:pStyle w:val="38"/>
+        <w:rPr>
+          <w:rFonts w:hint="default"/>
+          <w:lang w:val="vi-VN"/>
+        </w:rPr>
+      </w:pPr>
+    </w:p>
+    <w:p>
+      <w:pPr>
+        <w:pStyle w:val="38"/>
+        <w:rPr>
+          <w:rFonts w:hint="default"/>
+          <w:lang w:val="vi-VN"/>
+        </w:rPr>
+      </w:pPr>
+    </w:p>
+    <w:p>
+      <w:pPr>
+        <w:pStyle w:val="38"/>
+        <w:rPr>
+          <w:rFonts w:hint="default"/>
+          <w:lang w:val="vi-VN"/>
+        </w:rPr>
+      </w:pPr>
+    </w:p>
+    <w:p>
+      <w:pPr>
+        <w:pStyle w:val="38"/>
+        <w:rPr>
+          <w:rFonts w:hint="default"/>
+          <w:lang w:val="vi-VN"/>
+        </w:rPr>
+      </w:pPr>
+    </w:p>
+    <w:p>
+      <w:pPr>
+        <w:pStyle w:val="38"/>
+        <w:rPr>
+          <w:rFonts w:hint="default"/>
+          <w:lang w:val="vi-VN"/>
+        </w:rPr>
+      </w:pPr>
+    </w:p>
+    <w:p>
+      <w:pPr>
+        <w:pStyle w:val="38"/>
+        <w:rPr>
+          <w:rFonts w:hint="default"/>
+          <w:lang w:val="vi-VN"/>
+        </w:rPr>
+      </w:pPr>
+    </w:p>
+    <w:p>
+      <w:pPr>
+        <w:pStyle w:val="38"/>
+        <w:rPr>
+          <w:rFonts w:hint="default"/>
+          <w:lang w:val="vi-VN"/>
+        </w:rPr>
+      </w:pPr>
+    </w:p>
+    <w:p>
+      <w:pPr>
+        <w:pStyle w:val="38"/>
+        <w:rPr>
+          <w:rFonts w:hint="default"/>
+          <w:lang w:val="vi-VN"/>
+        </w:rPr>
+      </w:pPr>
+    </w:p>
+    <w:p>
+      <w:pPr>
+        <w:pStyle w:val="38"/>
+        <w:rPr>
+          <w:rFonts w:hint="default"/>
+          <w:lang w:val="vi-VN"/>
+        </w:rPr>
+      </w:pPr>
     </w:p>
     <w:p>
       <w:pPr>
@@ -4045,7 +4254,9 @@
         <w:ind w:left="360" w:hanging="360"/>
       </w:pPr>
       <w:rPr>
-        <w:rFonts w:ascii="Times New Roman" w:hAnsi="Times New Roman" w:eastAsiaTheme="minorHAnsi" w:cstheme="minorBidi"/>
+        <w:rFonts w:hint="default" w:ascii="Times New Roman" w:hAnsi="Times New Roman" w:eastAsia="Aptos" w:cstheme="minorBidi"/>
+        <w:b/>
+        <w:bCs/>
       </w:rPr>
     </w:lvl>
     <w:lvl w:ilvl="1" w:tentative="0">
@@ -4335,7 +4546,7 @@
     <w:lsdException w:qFormat="1" w:unhideWhenUsed="0" w:uiPriority="34" w:semiHidden="0" w:name="List Paragraph"/>
     <w:lsdException w:qFormat="1" w:unhideWhenUsed="0" w:uiPriority="29" w:semiHidden="0" w:name="Quote"/>
     <w:lsdException w:qFormat="1" w:unhideWhenUsed="0" w:uiPriority="30" w:semiHidden="0" w:name="Intense Quote"/>
-    <w:lsdException w:qFormat="1" w:unhideWhenUsed="0" w:uiPriority="66" w:semiHidden="0" w:name="Medium List 2 Accent 1"/>
+    <w:lsdException w:unhideWhenUsed="0" w:uiPriority="66" w:semiHidden="0" w:name="Medium List 2 Accent 1"/>
     <w:lsdException w:unhideWhenUsed="0" w:uiPriority="67" w:semiHidden="0" w:name="Medium Grid 1 Accent 1"/>
     <w:lsdException w:unhideWhenUsed="0" w:uiPriority="68" w:semiHidden="0" w:name="Medium Grid 2 Accent 1"/>
     <w:lsdException w:unhideWhenUsed="0" w:uiPriority="69" w:semiHidden="0" w:name="Medium Grid 3 Accent 1"/>
@@ -4360,7 +4571,7 @@
     <w:lsdException w:unhideWhenUsed="0" w:uiPriority="60" w:semiHidden="0" w:name="Light Shading Accent 3"/>
     <w:lsdException w:unhideWhenUsed="0" w:uiPriority="61" w:semiHidden="0" w:name="Light List Accent 3"/>
     <w:lsdException w:unhideWhenUsed="0" w:uiPriority="62" w:semiHidden="0" w:name="Light Grid Accent 3"/>
-    <w:lsdException w:qFormat="1" w:unhideWhenUsed="0" w:uiPriority="63" w:semiHidden="0" w:name="Medium Shading 1 Accent 3"/>
+    <w:lsdException w:unhideWhenUsed="0" w:uiPriority="63" w:semiHidden="0" w:name="Medium Shading 1 Accent 3"/>
     <w:lsdException w:unhideWhenUsed="0" w:uiPriority="64" w:semiHidden="0" w:name="Medium Shading 2 Accent 3"/>
     <w:lsdException w:unhideWhenUsed="0" w:uiPriority="65" w:semiHidden="0" w:name="Medium List 1 Accent 3"/>
     <w:lsdException w:unhideWhenUsed="0" w:uiPriority="66" w:semiHidden="0" w:name="Medium List 2 Accent 3"/>
@@ -4376,7 +4587,7 @@
     <w:lsdException w:unhideWhenUsed="0" w:uiPriority="62" w:semiHidden="0" w:name="Light Grid Accent 4"/>
     <w:lsdException w:unhideWhenUsed="0" w:uiPriority="63" w:semiHidden="0" w:name="Medium Shading 1 Accent 4"/>
     <w:lsdException w:unhideWhenUsed="0" w:uiPriority="64" w:semiHidden="0" w:name="Medium Shading 2 Accent 4"/>
-    <w:lsdException w:qFormat="1" w:unhideWhenUsed="0" w:uiPriority="65" w:semiHidden="0" w:name="Medium List 1 Accent 4"/>
+    <w:lsdException w:unhideWhenUsed="0" w:uiPriority="65" w:semiHidden="0" w:name="Medium List 1 Accent 4"/>
     <w:lsdException w:unhideWhenUsed="0" w:uiPriority="66" w:semiHidden="0" w:name="Medium List 2 Accent 4"/>
     <w:lsdException w:unhideWhenUsed="0" w:uiPriority="67" w:semiHidden="0" w:name="Medium Grid 1 Accent 4"/>
     <w:lsdException w:unhideWhenUsed="0" w:uiPriority="68" w:semiHidden="0" w:name="Medium Grid 2 Accent 4"/>
@@ -4403,7 +4614,7 @@
     <w:lsdException w:unhideWhenUsed="0" w:uiPriority="61" w:semiHidden="0" w:name="Light List Accent 6"/>
     <w:lsdException w:unhideWhenUsed="0" w:uiPriority="62" w:semiHidden="0" w:name="Light Grid Accent 6"/>
     <w:lsdException w:unhideWhenUsed="0" w:uiPriority="63" w:semiHidden="0" w:name="Medium Shading 1 Accent 6"/>
-    <w:lsdException w:qFormat="1" w:unhideWhenUsed="0" w:uiPriority="64" w:semiHidden="0" w:name="Medium Shading 2 Accent 6"/>
+    <w:lsdException w:unhideWhenUsed="0" w:uiPriority="64" w:semiHidden="0" w:name="Medium Shading 2 Accent 6"/>
     <w:lsdException w:unhideWhenUsed="0" w:uiPriority="65" w:semiHidden="0" w:name="Medium List 1 Accent 6"/>
     <w:lsdException w:unhideWhenUsed="0" w:uiPriority="66" w:semiHidden="0" w:name="Medium List 2 Accent 6"/>
     <w:lsdException w:unhideWhenUsed="0" w:uiPriority="67" w:semiHidden="0" w:name="Medium Grid 1 Accent 6"/>

</xml_diff>